<commit_message>
docs: redaction notice in appendix B; regenerate docx/html
</commit_message>
<xml_diff>
--- a/paper/report-v1.docx
+++ b/paper/report-v1.docx
@@ -3678,6 +3678,9 @@
         <w:spacing w:after="120"/>
       </w:pPr>
       <w:r>
+        <w:t>The compressed original of the session log (</w:t>
+      </w:r>
+      <w:r>
         <w:rPr>
           <w:rFonts w:ascii="Consolas" w:hAnsi="Consolas"/>
           <w:sz w:val="18"/>
@@ -3685,7 +3688,7 @@
         <w:t>session.v4.jsonl.zstd</w:t>
       </w:r>
       <w:r>
-        <w:t xml:space="preserve"> is 5,990 concatenated zstd frames. A single call to </w:t>
+        <w:t xml:space="preserve">, 12.7 MB) is 5,990 concatenated zstd frames. A single call to </w:t>
       </w:r>
       <w:r>
         <w:rPr>
@@ -3695,7 +3698,51 @@
         <w:t>zlib.zstdDecompressSync</w:t>
       </w:r>
       <w:r>
-        <w:t xml:space="preserve"> returns only the first frame, which is 192 bytes of session header. The expanded file is 47.3 MB. This cost me an hour and is worth writing down.</w:t>
+        <w:t xml:space="preserve"> returns only the first frame — 192 bytes of session header. This cost me an hour and is worth writing down for anyone who obtains the compressed form elsewhere.</w:t>
+      </w:r>
+    </w:p>
+    <w:p>
+      <w:pPr>
+        <w:spacing w:after="120"/>
+      </w:pPr>
+      <w:r>
+        <w:rPr>
+          <w:b/>
+        </w:rPr>
+        <w:t>That file is not shipped with this dataset.</w:t>
+      </w:r>
+      <w:r>
+        <w:t xml:space="preserve"> During the session a configuration dump printed a live </w:t>
+      </w:r>
+      <w:r>
+        <w:rPr>
+          <w:rFonts w:ascii="Consolas" w:hAnsi="Consolas"/>
+          <w:sz w:val="18"/>
+        </w:rPr>
+        <w:t>DEEPSEEK_API_KEY</w:t>
+      </w:r>
+      <w:r>
+        <w:t xml:space="preserve">, and the value landed in the log. The compressed original still carries it, and re-compressing would change the bytes without removing the secret. The plain-text log in </w:t>
+      </w:r>
+      <w:r>
+        <w:rPr>
+          <w:rFonts w:ascii="Consolas" w:hAnsi="Consolas"/>
+          <w:sz w:val="18"/>
+        </w:rPr>
+        <w:t>session/</w:t>
+      </w:r>
+      <w:r>
+        <w:t xml:space="preserve"> is the redacted one: a single substitution of the key for </w:t>
+      </w:r>
+      <w:r>
+        <w:rPr>
+          <w:rFonts w:ascii="Consolas" w:hAnsi="Consolas"/>
+          <w:sz w:val="18"/>
+        </w:rPr>
+        <w:t>sk-***REDACTED***</w:t>
+      </w:r>
+      <w:r>
+        <w:t>, touching a configuration listing rather than a reasoning step, so no annotation or statistic in this report changes.</w:t>
       </w:r>
     </w:p>
     <w:sectPr>

</xml_diff>